<commit_message>
Refine practical work details from photos
</commit_message>
<xml_diff>
--- a/RepairRequestsApp/Practical_works_2-6.docx
+++ b/RepairRequestsApp/Practical_works_2-6.docx
@@ -116,7 +116,7 @@
     </w:p>
     <w:p>
       <w:r>
-        <w:t>Для учебного варианта ООО «Фирма» принимается производственно-торговая организация: она закупает сырье и материалы, выпускает готовую продукцию и реализует ее покупателям. Структура ниже сформирована по перечню функций из методических материалов.</w:t>
+        <w:t>В примере на фотографиях ООО «Фирма» перерабатывает молоко. Производство включает цех цельномолочной продукции, цех сыродельного производства и цех сухих продуктов. Удаленный цех мороженого расположен примерно в 2 км от основной площадки. Заготовкой сырья занимается отдел с главным приемным пунктом и восемью молокоприемными пунктами. Лаборатория контролирует поступающее молоко и готовую продукцию, а сбыт ведут отдел комбината и три торговых дома.</w:t>
       </w:r>
     </w:p>
     <w:tbl>
@@ -1448,7 +1448,7 @@
     </w:tbl>
     <w:p>
       <w:r>
-        <w:t>Ведомость указывает: всего 5 компьютеров требуется заменить, 2 — под вопросом; количество устанавливаемых мониторов — 3. Перечень следует сверить с фактической инвентаризацией, поскольку в распознанной части таблицы отметки о замене относятся к большему числу строк, чем итоговое примечание.</w:t>
+        <w:t>Итоговое примечание к ведомости указывает: 5 компьютеров требуется заменить, еще 2 — под вопросом; устаревших мониторов — 5. В видимой части таблиц есть несколько пометок «Замена», поэтому окончательный перечень конкретных инвентарных номеров следует подтвердить очной инвентаризацией до закупки.</w:t>
       </w:r>
     </w:p>
     <w:p>
@@ -1540,7 +1540,7 @@
     </w:p>
     <w:p>
       <w:r>
-        <w:t>ООО «Фирма» рассматривается как производственно-торговая организация. Основной цикл включает закупку материалов и сырья, производство, контроль качества, складирование и реализацию готовой продукции. В работе участвуют руководители, бухгалтерия, производство, склад, снабжение, продажи, кадры и лаборатория.</w:t>
+        <w:t>ООО «Фирма» в примере представляет молокоперерабатывающий комбинат. Основной цикл включает прием молока, выпуск цельномолочной, сыродельной и сухой продукции, контроль качества, складирование и сбыт. Удаленно работает цех мороженого; сырье принимают главный пункт и восемь молокоприемных пунктов. В работе участвуют руководство, производство, отдел заготовок, снабжение, сбыт, бухгалтерия, лаборатория и вспомогательные подразделения.</w:t>
       </w:r>
     </w:p>
     <w:p>

</xml_diff>

<commit_message>
Align computer park details with practice photo
</commit_message>
<xml_diff>
--- a/RepairRequestsApp/Practical_works_2-6.docx
+++ b/RepairRequestsApp/Practical_works_2-6.docx
@@ -963,9 +963,317 @@
     </w:p>
     <w:p>
       <w:r>
-        <w:t>Инвентаризация по фотографии содержит перечень 50 рабочих мест и серверов, однако спецификации отдельных компонентов частично неразборчивы. Поэтому ниже приведены читаемые сведения и порядок актуализации реестра. В таблицах перечислены рабочие места с заменой или вопросом по состоянию.</w:t>
+        <w:t>В примере указано, что на комбинате установлено 44 компьютера. Ниже приведены категории процессоров из сводки и отдельные рабочие места, для которых в ведомости отмечена замена или необходимость уточнить состояние.</w:t>
       </w:r>
     </w:p>
+    <w:tbl>
+      <w:tblPr>
+        <w:tblStyle w:val="TableGrid"/>
+        <w:tblW w:type="auto" w:w="0"/>
+        <w:jc w:val="center"/>
+        <w:tblLook w:firstColumn="1" w:firstRow="1" w:lastColumn="0" w:lastRow="0" w:noHBand="0" w:noVBand="1" w:val="04A0"/>
+      </w:tblPr>
+      <w:tblGrid>
+        <w:gridCol w:w="4968"/>
+        <w:gridCol w:w="4968"/>
+      </w:tblGrid>
+      <w:tr>
+        <w:tc>
+          <w:tcPr>
+            <w:tcW w:type="dxa" w:w="4968"/>
+            <w:vAlign w:val="center"/>
+            <w:shd w:fill="DCE6F1"/>
+          </w:tcPr>
+          <w:p>
+            <w:r>
+              <w:rPr>
+                <w:b/>
+              </w:rPr>
+              <w:t>Процессор по сводке</w:t>
+            </w:r>
+          </w:p>
+        </w:tc>
+        <w:tc>
+          <w:tcPr>
+            <w:tcW w:type="dxa" w:w="4968"/>
+            <w:vAlign w:val="center"/>
+            <w:shd w:fill="DCE6F1"/>
+          </w:tcPr>
+          <w:p>
+            <w:r>
+              <w:rPr>
+                <w:b/>
+              </w:rPr>
+              <w:t>Количество</w:t>
+            </w:r>
+          </w:p>
+        </w:tc>
+      </w:tr>
+      <w:tr>
+        <w:tc>
+          <w:tcPr>
+            <w:tcW w:type="dxa" w:w="4968"/>
+            <w:vAlign w:val="center"/>
+          </w:tcPr>
+          <w:p>
+            <w:r>
+              <w:t>286</w:t>
+            </w:r>
+          </w:p>
+        </w:tc>
+        <w:tc>
+          <w:tcPr>
+            <w:tcW w:type="dxa" w:w="4968"/>
+            <w:vAlign w:val="center"/>
+          </w:tcPr>
+          <w:p>
+            <w:r>
+              <w:t>1</w:t>
+            </w:r>
+          </w:p>
+        </w:tc>
+      </w:tr>
+      <w:tr>
+        <w:tc>
+          <w:tcPr>
+            <w:tcW w:type="dxa" w:w="4968"/>
+            <w:vAlign w:val="center"/>
+          </w:tcPr>
+          <w:p>
+            <w:r>
+              <w:t>386</w:t>
+            </w:r>
+          </w:p>
+        </w:tc>
+        <w:tc>
+          <w:tcPr>
+            <w:tcW w:type="dxa" w:w="4968"/>
+            <w:vAlign w:val="center"/>
+          </w:tcPr>
+          <w:p>
+            <w:r>
+              <w:t>2</w:t>
+            </w:r>
+          </w:p>
+        </w:tc>
+      </w:tr>
+      <w:tr>
+        <w:tc>
+          <w:tcPr>
+            <w:tcW w:type="dxa" w:w="4968"/>
+            <w:vAlign w:val="center"/>
+          </w:tcPr>
+          <w:p>
+            <w:r>
+              <w:t>486</w:t>
+            </w:r>
+          </w:p>
+        </w:tc>
+        <w:tc>
+          <w:tcPr>
+            <w:tcW w:type="dxa" w:w="4968"/>
+            <w:vAlign w:val="center"/>
+          </w:tcPr>
+          <w:p>
+            <w:r>
+              <w:t>1</w:t>
+            </w:r>
+          </w:p>
+        </w:tc>
+      </w:tr>
+      <w:tr>
+        <w:tc>
+          <w:tcPr>
+            <w:tcW w:type="dxa" w:w="4968"/>
+            <w:vAlign w:val="center"/>
+          </w:tcPr>
+          <w:p>
+            <w:r>
+              <w:t>Celeron 433</w:t>
+            </w:r>
+          </w:p>
+        </w:tc>
+        <w:tc>
+          <w:tcPr>
+            <w:tcW w:type="dxa" w:w="4968"/>
+            <w:vAlign w:val="center"/>
+          </w:tcPr>
+          <w:p>
+            <w:r>
+              <w:t>1</w:t>
+            </w:r>
+          </w:p>
+        </w:tc>
+      </w:tr>
+      <w:tr>
+        <w:tc>
+          <w:tcPr>
+            <w:tcW w:type="dxa" w:w="4968"/>
+            <w:vAlign w:val="center"/>
+          </w:tcPr>
+          <w:p>
+            <w:r>
+              <w:t>Celeron 466</w:t>
+            </w:r>
+          </w:p>
+        </w:tc>
+        <w:tc>
+          <w:tcPr>
+            <w:tcW w:type="dxa" w:w="4968"/>
+            <w:vAlign w:val="center"/>
+          </w:tcPr>
+          <w:p>
+            <w:r>
+              <w:t>6</w:t>
+            </w:r>
+          </w:p>
+        </w:tc>
+      </w:tr>
+      <w:tr>
+        <w:tc>
+          <w:tcPr>
+            <w:tcW w:type="dxa" w:w="4968"/>
+            <w:vAlign w:val="center"/>
+          </w:tcPr>
+          <w:p>
+            <w:r>
+              <w:t>Celeron 633</w:t>
+            </w:r>
+          </w:p>
+        </w:tc>
+        <w:tc>
+          <w:tcPr>
+            <w:tcW w:type="dxa" w:w="4968"/>
+            <w:vAlign w:val="center"/>
+          </w:tcPr>
+          <w:p>
+            <w:r>
+              <w:t>2</w:t>
+            </w:r>
+          </w:p>
+        </w:tc>
+      </w:tr>
+      <w:tr>
+        <w:tc>
+          <w:tcPr>
+            <w:tcW w:type="dxa" w:w="4968"/>
+            <w:vAlign w:val="center"/>
+          </w:tcPr>
+          <w:p>
+            <w:r>
+              <w:t>Celeron 700</w:t>
+            </w:r>
+          </w:p>
+        </w:tc>
+        <w:tc>
+          <w:tcPr>
+            <w:tcW w:type="dxa" w:w="4968"/>
+            <w:vAlign w:val="center"/>
+          </w:tcPr>
+          <w:p>
+            <w:r>
+              <w:t>2</w:t>
+            </w:r>
+          </w:p>
+        </w:tc>
+      </w:tr>
+      <w:tr>
+        <w:tc>
+          <w:tcPr>
+            <w:tcW w:type="dxa" w:w="4968"/>
+            <w:vAlign w:val="center"/>
+          </w:tcPr>
+          <w:p>
+            <w:r>
+              <w:t>Celeron 1700</w:t>
+            </w:r>
+          </w:p>
+        </w:tc>
+        <w:tc>
+          <w:tcPr>
+            <w:tcW w:type="dxa" w:w="4968"/>
+            <w:vAlign w:val="center"/>
+          </w:tcPr>
+          <w:p>
+            <w:r>
+              <w:t>6</w:t>
+            </w:r>
+          </w:p>
+        </w:tc>
+      </w:tr>
+      <w:tr>
+        <w:tc>
+          <w:tcPr>
+            <w:tcW w:type="dxa" w:w="4968"/>
+            <w:vAlign w:val="center"/>
+          </w:tcPr>
+          <w:p>
+            <w:r>
+              <w:t>Pentium II</w:t>
+            </w:r>
+          </w:p>
+        </w:tc>
+        <w:tc>
+          <w:tcPr>
+            <w:tcW w:type="dxa" w:w="4968"/>
+            <w:vAlign w:val="center"/>
+          </w:tcPr>
+          <w:p>
+            <w:r>
+              <w:t>1</w:t>
+            </w:r>
+          </w:p>
+        </w:tc>
+      </w:tr>
+      <w:tr>
+        <w:tc>
+          <w:tcPr>
+            <w:tcW w:type="dxa" w:w="4968"/>
+            <w:vAlign w:val="center"/>
+          </w:tcPr>
+          <w:p>
+            <w:r>
+              <w:t>Pentium III</w:t>
+            </w:r>
+          </w:p>
+        </w:tc>
+        <w:tc>
+          <w:tcPr>
+            <w:tcW w:type="dxa" w:w="4968"/>
+            <w:vAlign w:val="center"/>
+          </w:tcPr>
+          <w:p>
+            <w:r>
+              <w:t>3</w:t>
+            </w:r>
+          </w:p>
+        </w:tc>
+      </w:tr>
+      <w:tr>
+        <w:tc>
+          <w:tcPr>
+            <w:tcW w:type="dxa" w:w="4968"/>
+            <w:vAlign w:val="center"/>
+          </w:tcPr>
+          <w:p>
+            <w:r>
+              <w:t>Pentium IV</w:t>
+            </w:r>
+          </w:p>
+        </w:tc>
+        <w:tc>
+          <w:tcPr>
+            <w:tcW w:type="dxa" w:w="4968"/>
+            <w:vAlign w:val="center"/>
+          </w:tcPr>
+          <w:p>
+            <w:r>
+              <w:t>19</w:t>
+            </w:r>
+          </w:p>
+        </w:tc>
+      </w:tr>
+    </w:tbl>
     <w:tbl>
       <w:tblPr>
         <w:tblStyle w:val="TableGrid"/>
@@ -1033,7 +1341,7 @@
           </w:tcPr>
           <w:p>
             <w:r>
-              <w:t>Начальник бухгалтерии</w:t>
+              <w:t>Бухгалтерия (касса)</w:t>
             </w:r>
           </w:p>
         </w:tc>
@@ -1044,7 +1352,7 @@
           </w:tcPr>
           <w:p>
             <w:r>
-              <w:t>Intel Pentium IV 1500 MHz; 512 MB RAM</w:t>
+              <w:t>Intel 80386DX; 4 MB RAM; 10 GB HDD</w:t>
             </w:r>
           </w:p>
         </w:tc>
@@ -1068,7 +1376,7 @@
           </w:tcPr>
           <w:p>
             <w:r>
-              <w:t>Бухгалтерия (касса)</w:t>
+              <w:t>Бухгалтерия (МОЛ)</w:t>
             </w:r>
           </w:p>
         </w:tc>
@@ -1079,7 +1387,112 @@
           </w:tcPr>
           <w:p>
             <w:r>
-              <w:t>Intel Pentium IV 1500 MHz; 512 MB RAM</w:t>
+              <w:t>AMD 133 MHz; 4 MB RAM; 2 GB HDD</w:t>
+            </w:r>
+          </w:p>
+        </w:tc>
+        <w:tc>
+          <w:tcPr>
+            <w:tcW w:type="dxa" w:w="3312"/>
+            <w:vAlign w:val="center"/>
+          </w:tcPr>
+          <w:p>
+            <w:r>
+              <w:t>Замена</w:t>
+            </w:r>
+          </w:p>
+        </w:tc>
+      </w:tr>
+      <w:tr>
+        <w:tc>
+          <w:tcPr>
+            <w:tcW w:type="dxa" w:w="3312"/>
+            <w:vAlign w:val="center"/>
+          </w:tcPr>
+          <w:p>
+            <w:r>
+              <w:t>Бухгалтерия (оптовая торговля)</w:t>
+            </w:r>
+          </w:p>
+        </w:tc>
+        <w:tc>
+          <w:tcPr>
+            <w:tcW w:type="dxa" w:w="3312"/>
+            <w:vAlign w:val="center"/>
+          </w:tcPr>
+          <w:p>
+            <w:r>
+              <w:t>Intel Pentium 133 MHz; 32 MB RAM; 1.5 GB HDD</w:t>
+            </w:r>
+          </w:p>
+        </w:tc>
+        <w:tc>
+          <w:tcPr>
+            <w:tcW w:type="dxa" w:w="3312"/>
+            <w:vAlign w:val="center"/>
+          </w:tcPr>
+          <w:p>
+            <w:r>
+              <w:t>Замена</w:t>
+            </w:r>
+          </w:p>
+        </w:tc>
+      </w:tr>
+      <w:tr>
+        <w:tc>
+          <w:tcPr>
+            <w:tcW w:type="dxa" w:w="3312"/>
+            <w:vAlign w:val="center"/>
+          </w:tcPr>
+          <w:p>
+            <w:r>
+              <w:t>Бухгалтерия (столовая)</w:t>
+            </w:r>
+          </w:p>
+        </w:tc>
+        <w:tc>
+          <w:tcPr>
+            <w:tcW w:type="dxa" w:w="3312"/>
+            <w:vAlign w:val="center"/>
+          </w:tcPr>
+          <w:p>
+            <w:r>
+              <w:t>Cyrix 486 56 MHz; 6 MB RAM; 10 GB HDD</w:t>
+            </w:r>
+          </w:p>
+        </w:tc>
+        <w:tc>
+          <w:tcPr>
+            <w:tcW w:type="dxa" w:w="3312"/>
+            <w:vAlign w:val="center"/>
+          </w:tcPr>
+          <w:p>
+            <w:r>
+              <w:t>Замена</w:t>
+            </w:r>
+          </w:p>
+        </w:tc>
+      </w:tr>
+      <w:tr>
+        <w:tc>
+          <w:tcPr>
+            <w:tcW w:type="dxa" w:w="3312"/>
+            <w:vAlign w:val="center"/>
+          </w:tcPr>
+          <w:p>
+            <w:r>
+              <w:t>Склад (рабочее место №38)</w:t>
+            </w:r>
+          </w:p>
+        </w:tc>
+        <w:tc>
+          <w:tcPr>
+            <w:tcW w:type="dxa" w:w="3312"/>
+            <w:vAlign w:val="center"/>
+          </w:tcPr>
+          <w:p>
+            <w:r>
+              <w:t>Intel Pentium 120 MHz; 24 MB RAM; 1.5 GB HDD</w:t>
             </w:r>
           </w:p>
         </w:tc>
@@ -1114,7 +1527,7 @@
           </w:tcPr>
           <w:p>
             <w:r>
-              <w:t>Intel Pentium IV 1500 MHz; 512 MB RAM</w:t>
+              <w:t>Intel Celeron 633 MHz; 64 MB RAM; 10 GB HDD</w:t>
             </w:r>
           </w:p>
         </w:tc>
@@ -1125,7 +1538,7 @@
           </w:tcPr>
           <w:p>
             <w:r>
-              <w:t>Замена</w:t>
+              <w:t>Уточнить</w:t>
             </w:r>
           </w:p>
         </w:tc>
@@ -1138,7 +1551,7 @@
           </w:tcPr>
           <w:p>
             <w:r>
-              <w:t>Бухгалтерия (МОЛ)</w:t>
+              <w:t>Бухгалтерия (реализация)</w:t>
             </w:r>
           </w:p>
         </w:tc>
@@ -1149,7 +1562,7 @@
           </w:tcPr>
           <w:p>
             <w:r>
-              <w:t>Intel Celeron 633 MHz; 64 MB RAM</w:t>
+              <w:t>Intel Pentium IV 1700 MHz; 256 MB RAM; 40 GB HDD</w:t>
             </w:r>
           </w:p>
         </w:tc>
@@ -1160,7 +1573,7 @@
           </w:tcPr>
           <w:p>
             <w:r>
-              <w:t>Замена</w:t>
+              <w:t>Уточнить</w:t>
             </w:r>
           </w:p>
         </w:tc>
@@ -1173,7 +1586,7 @@
           </w:tcPr>
           <w:p>
             <w:r>
-              <w:t>Бухгалтерия (основные средства)</w:t>
+              <w:t>Отдел снабжения</w:t>
             </w:r>
           </w:p>
         </w:tc>
@@ -1184,7 +1597,7 @@
           </w:tcPr>
           <w:p>
             <w:r>
-              <w:t>Intel Pentium 133 MHz; 32 MB RAM</w:t>
+              <w:t>Intel Pentium IV 1500 MHz; 512 MB RAM; 40 GB HDD</w:t>
             </w:r>
           </w:p>
         </w:tc>
@@ -1195,112 +1608,7 @@
           </w:tcPr>
           <w:p>
             <w:r>
-              <w:t>Замена</w:t>
-            </w:r>
-          </w:p>
-        </w:tc>
-      </w:tr>
-      <w:tr>
-        <w:tc>
-          <w:tcPr>
-            <w:tcW w:type="dxa" w:w="3312"/>
-            <w:vAlign w:val="center"/>
-          </w:tcPr>
-          <w:p>
-            <w:r>
-              <w:t>Склад</w:t>
-            </w:r>
-          </w:p>
-        </w:tc>
-        <w:tc>
-          <w:tcPr>
-            <w:tcW w:type="dxa" w:w="3312"/>
-            <w:vAlign w:val="center"/>
-          </w:tcPr>
-          <w:p>
-            <w:r>
-              <w:t>Intel Pentium IV 1700 MHz; 256 MB RAM</w:t>
-            </w:r>
-          </w:p>
-        </w:tc>
-        <w:tc>
-          <w:tcPr>
-            <w:tcW w:type="dxa" w:w="3312"/>
-            <w:vAlign w:val="center"/>
-          </w:tcPr>
-          <w:p>
-            <w:r>
-              <w:t>Замена</w:t>
-            </w:r>
-          </w:p>
-        </w:tc>
-      </w:tr>
-      <w:tr>
-        <w:tc>
-          <w:tcPr>
-            <w:tcW w:type="dxa" w:w="3312"/>
-            <w:vAlign w:val="center"/>
-          </w:tcPr>
-          <w:p>
-            <w:r>
-              <w:t>Бухгалтерия / финансы</w:t>
-            </w:r>
-          </w:p>
-        </w:tc>
-        <w:tc>
-          <w:tcPr>
-            <w:tcW w:type="dxa" w:w="3312"/>
-            <w:vAlign w:val="center"/>
-          </w:tcPr>
-          <w:p>
-            <w:r>
-              <w:t>Intel Celeron 466 MHz; 64 MB RAM</w:t>
-            </w:r>
-          </w:p>
-        </w:tc>
-        <w:tc>
-          <w:tcPr>
-            <w:tcW w:type="dxa" w:w="3312"/>
-            <w:vAlign w:val="center"/>
-          </w:tcPr>
-          <w:p>
-            <w:r>
-              <w:t>Замена</w:t>
-            </w:r>
-          </w:p>
-        </w:tc>
-      </w:tr>
-      <w:tr>
-        <w:tc>
-          <w:tcPr>
-            <w:tcW w:type="dxa" w:w="3312"/>
-            <w:vAlign w:val="center"/>
-          </w:tcPr>
-          <w:p>
-            <w:r>
-              <w:t>Бухгалтерия (зарплата)</w:t>
-            </w:r>
-          </w:p>
-        </w:tc>
-        <w:tc>
-          <w:tcPr>
-            <w:tcW w:type="dxa" w:w="3312"/>
-            <w:vAlign w:val="center"/>
-          </w:tcPr>
-          <w:p>
-            <w:r>
-              <w:t>Intel Pentium IV 1700 MHz; 256 MB RAM</w:t>
-            </w:r>
-          </w:p>
-        </w:tc>
-        <w:tc>
-          <w:tcPr>
-            <w:tcW w:type="dxa" w:w="3312"/>
-            <w:vAlign w:val="center"/>
-          </w:tcPr>
-          <w:p>
-            <w:r>
-              <w:t>Замена</w:t>
+              <w:t>Уточнить</w:t>
             </w:r>
           </w:p>
         </w:tc>
@@ -1448,7 +1756,7 @@
     </w:tbl>
     <w:p>
       <w:r>
-        <w:t>Итоговое примечание к ведомости указывает: 5 компьютеров требуется заменить, еще 2 — под вопросом; устаревших мониторов — 5. В видимой части таблиц есть несколько пометок «Замена», поэтому окончательный перечень конкретных инвентарных номеров следует подтвердить очной инвентаризацией до закупки.</w:t>
+        <w:t>Итоговое примечание к ведомости указывает: 5 компьютеров требуется заменить, еще 2 — под вопросом; устаревших мониторов — 5. В читаемой части таблиц непосредственно отмечены три конкретные позиции «Замена», поэтому полный список на замену и два спорных рабочих места нужно уточнить по оригинальной ведомости и очной инвентаризацией до закупки.</w:t>
       </w:r>
     </w:p>
     <w:p>

</xml_diff>